<commit_message>
Assign Astronomy Thought History volume 377 and ISBN; refresh Books and Monographs shelves with US$20 metadata
</commit_message>
<xml_diff>
--- a/public/books/astronomy-thought-history/downloads/astronomy-reader-v1.1.docx
+++ b/public/books/astronomy-thought-history/downloads/astronomy-reader-v1.1.docx
@@ -142,6 +142,10 @@
         <w:pStyle w:val="FrontText"/>
       </w:pPr>
       <w:r>
+        <w:t>德麦国际专著第377卷 · 定价：US$20</w:t>
+        <w:br/>
+        <w:t>ISBN：979-8-90690-953-4</w:t>
+        <w:br/>
         <w:t>出版与平台：德麦国际出版社 · SDE Universes</w:t>
       </w:r>
     </w:p>

</xml_diff>

<commit_message>
Correct volume 377 author to 阳涌 across shelves, book pages, covers, reading files and learning agent
</commit_message>
<xml_diff>
--- a/public/books/astronomy-thought-history/downloads/astronomy-reader-v1.1.docx
+++ b/public/books/astronomy-thought-history/downloads/astronomy-reader-v1.1.docx
@@ -82,7 +82,7 @@
         <w:pStyle w:val="FrontText"/>
       </w:pPr>
       <w:r>
-        <w:t>阳勇 著</w:t>
+        <w:t>阳涌 著</w:t>
       </w:r>
     </w:p>
     <w:p>
@@ -126,7 +126,7 @@
         <w:pStyle w:val="FrontText"/>
       </w:pPr>
       <w:r>
-        <w:t>作者：阳勇　　指导老师：王德生</w:t>
+        <w:t>作者：阳涌　　指导老师：王德生</w:t>
       </w:r>
     </w:p>
     <w:p>
@@ -195,7 +195,7 @@
         <w:pStyle w:val="Heading3"/>
       </w:pPr>
       <w:r>
-        <w:t>作者 阳勇</w:t>
+        <w:t>作者 阳涌</w:t>
       </w:r>
     </w:p>
     <w:p>
@@ -203,7 +203,7 @@
         <w:pStyle w:val="FrontText"/>
       </w:pPr>
       <w:r>
-        <w:t>阳勇，SDE学员，英语语言文学硕士。长期从事一线教学与课程改革，关注语言、数学、思维与人工智能教育的融合。自2019年起跟随王德生博士研修三视角、321智慧、SIO及SDE本体论，研究生成式学习、数学底层结构、创新阅读与教育智能体，探索知识在学科、生活与真实问题之间的生成和迁移。</w:t>
+        <w:t>阳涌，SDE学员，英语语言文学硕士。长期从事一线教学与课程改革，关注语言、数学、思维与人工智能教育的融合。自2019年起跟随王德生博士研修三视角、321智慧、SIO及SDE本体论，研究生成式学习、数学底层结构、创新阅读与教育智能体，探索知识在学科、生活与真实问题之间的生成和迁移。</w:t>
       </w:r>
     </w:p>
     <w:p>
@@ -30338,7 +30338,7 @@
       </w:rPr>
       <w:t>天文学思想史</w:t>
       <w:tab/>
-      <w:t>阳勇 著</w:t>
+      <w:t>阳涌 著</w:t>
     </w:r>
   </w:p>
 </w:hdr>

</xml_diff>